<commit_message>
Renato Aragão: revisão parte 5
Co-Authored-By: Claude Opus 5.5 <noreply@anthropic.com>
Claude-Session: https://claude.ai/code/session_01MJjUEEZrxQDEUifKK2vj9g
</commit_message>
<xml_diff>
--- a/roteiros/renato-aragao/RenatoAragao_Parte5.docx
+++ b/roteiros/renato-aragao/RenatoAragao_Parte5.docx
@@ -63,7 +63,7 @@
         <w:rPr>
           <w:color w:val="000000"/>
         </w:rPr>
-        <w:t>Esse é o segredo repugnante que a imagem do bom velhinho escondeu por tanto tempo. Uma frase que reduz os próprios companheiros a bichos. Dita, segundo quem estava lá, no dia em que eles ousaram cobrar a parte que achavam justa.</w:t>
+        <w:t>Esse é o segredo repugnante que a imagem do bom velhinho escondeu por tanto tempo. Uma frase que compara os próprios companheiros a bichos e usa um insulto homofóbico. Dita, segundo quem estava lá, logo depois que eles ousaram cobrar a parte que achavam justa.</w:t>
       </w:r>
     </w:p>
     <w:p>
@@ -143,15 +143,7 @@
         <w:rPr>
           <w:color w:val="C00000"/>
         </w:rPr>
-        <w:t>Agora lembre do que o Didi disse em dois mil e quinze, na entrevista à Playboy. Que humor não devia machucar ninguém. Que certas piadas eram agressivas demais. Porque, quando você coloca essas duas imagens lado a lado, percebe o tamanho da distância entre o palhaço e o homem.</w:t>
-      </w:r>
-    </w:p>
-    <w:p>
-      <w:r>
-        <w:rPr>
-          <w:color w:val="000000"/>
-        </w:rPr>
-        <w:t>Em dois mil e quinze, Renato criticou o Porta dos Fundos por fazer piada com religião. Disse que aquilo machucava as pessoas.</w:t>
+        <w:t>Agora lembre do que o Didi disse em dois mil e quinze, na entrevista à Playboy. Que piada com religião era agressiva e machucava as pessoas. Porque, quando você coloca essas duas imagens lado a lado, percebe o tamanho da distância entre o palhaço e o homem.</w:t>
       </w:r>
     </w:p>
     <w:p>
@@ -167,7 +159,7 @@
         <w:rPr>
           <w:color w:val="000000"/>
         </w:rPr>
-        <w:t>Até onde se sabe, Renato Aragão não respondeu publicamente a esses depoimentos específicos. O que se sabe é que os advogados dele manifestaram interesse em barrar a série. E que, quando foi acusado por ex-funcionários, ele chamou os acusadores de mentirosos e prometeu que iam pagar muito caro.</w:t>
+        <w:t>Até onde se sabe, Renato Aragão não respondeu publicamente a esses depoimentos específicos. O que se sabe é que os advogados dele manifestaram interesse em barrar a série.</w:t>
       </w:r>
     </w:p>
     <w:p>
@@ -191,7 +183,7 @@
         <w:rPr>
           <w:color w:val="C00000"/>
         </w:rPr>
-        <w:t>Só que a história do dinheiro dos Trapalhões ainda não acabou. Porque, neste mês de setembro de dois mil e vinte e seis, ela voltou a aparecer. Dessa vez, num processo na Justiça. E quem abriu a ação trabalhou em produções do Didi no começo dos anos noventa.</w:t>
+        <w:t>Só que a história do dinheiro nas produções do Didi ainda não acabou. Porque, neste mês de setembro de dois mil e vinte e seis, ela voltou a aparecer. Dessa vez, num processo na Justiça. E quem abriu a ação trabalhou em produções do Didi no começo dos anos noventa.</w:t>
       </w:r>
     </w:p>
     <w:p>
@@ -255,7 +247,7 @@
         <w:rPr>
           <w:color w:val="000000"/>
         </w:rPr>
-        <w:t>Mais de quarenta anos depois dos contratos de oitenta e dois por cento, o dinheiro dos Trapalhões continua passando pelo mesmo lugar.</w:t>
+        <w:t>Mais de quarenta anos depois dos contratos de oitenta e dois por cento, o dinheiro das produções do Didi continua passando pelo mesmo lugar.</w:t>
       </w:r>
     </w:p>
     <w:p>

</xml_diff>

<commit_message>
Renato Aragão: remove insultos da citação
Co-Authored-By: Claude Opus 5.5 <noreply@anthropic.com>
Claude-Session: https://claude.ai/code/session_01MJjUEEZrxQDEUifKK2vj9g
</commit_message>
<xml_diff>
--- a/roteiros/renato-aragao/RenatoAragao_Parte5.docx
+++ b/roteiros/renato-aragao/RenatoAragao_Parte5.docx
@@ -47,7 +47,15 @@
         <w:rPr>
           <w:color w:val="000000"/>
         </w:rPr>
-        <w:t>"Não preciso deles. Posso fazer a mesma coisa tendo um cachorro, um macaco e um veado."</w:t>
+        <w:t>"Não preciso deles."</w:t>
+      </w:r>
+    </w:p>
+    <w:p>
+      <w:r>
+        <w:rPr>
+          <w:color w:val="000000"/>
+        </w:rPr>
+        <w:t>E completou dizendo que podia fazer a mesma coisa colocando no lugar dos três alguns bichos e uma palavra usada para humilhar homens gays.</w:t>
       </w:r>
     </w:p>
     <w:p>

</xml_diff>